<commit_message>
Katman 1: backtest'i gerçek horizon'a hizala (bitişik split)
İnceleme bulgusu: §7'nin '7 gün boşluk' kuralı backtest'i origin'den h=8..14'e
kaydırıyordu; gerçek görev h=1..7 (28 Haz -> 29 Haz-5 Tem). Sızıntıyı zaten
boşluk değil lag>=ufuk (7/14/28 >= 7) önlüyor. Split default bitişik yapıldı
(ayrim_gun ile boşluk hâlâ opsiyonel), mimari §7 düzeltildi, docx yenilendi.

Ek: panel.py'ye lag>=ufuk sızıntı garantisi belgelendi. 44 test yeşil.
</commit_message>
<xml_diff>
--- a/docs/GELISMIS_Sistem_Mimarisi_v4.docx
+++ b/docs/GELISMIS_Sistem_Mimarisi_v4.docx
@@ -7590,16 +7590,25 @@
         <w:t>Walk-forward</w:t>
       </w:r>
       <w:r>
-        <w:t xml:space="preserve">, 5 kat, eğitim→test arası </w:t>
+        <w:t xml:space="preserve">, 5 kat, test penceresi eğitimin </w:t>
       </w:r>
       <w:r>
         <w:rPr>
           <w:b/>
         </w:rPr>
-        <w:t>7 gün boşluk</w:t>
-      </w:r>
-      <w:r>
-        <w:t xml:space="preserve"> (sızıntı önlemi). Ufuk 7 gün olduğu için boşluk ufka eşit olmalı.</w:t>
+        <w:t>hemen ardından</w:t>
+      </w:r>
+      <w:r>
+        <w:t xml:space="preserve"> (bitişik). Gerçek görev "veri sonundan sonraki 7 günü tahmin et" (28 Haz → 29 Haz–5 Tem = origin'den 1–7 gün ileri); backtest de birebir bunu ölçmeli. </w:t>
+      </w:r>
+      <w:r>
+        <w:rPr>
+          <w:b/>
+        </w:rPr>
+        <w:t>Sızıntı önlemi boşluk DEĞİL, lag seçimidir:</w:t>
+      </w:r>
+      <w:r>
+        <w:t xml:space="preserve"> en küçük lag (7) = ufuk (7 gün), dolayısıyla 7 günlük tahmin bloğu origin'i geçip geleceğe bakamaz (5 Tem için bile lag_7 = 28 Haz = origin). *v4 notu: v3'ün "7 gün boşluk" kuralı backtest'i h=8–14'e kaydırıyordu — gerçek görevden (h=1–7) daha zor bir problem ölçüyordu; düzeltildi.*</w:t>
       </w:r>
     </w:p>
     <w:p>
@@ -7607,7 +7616,7 @@
         <w:pStyle w:val="ListBullet"/>
       </w:pPr>
       <w:r>
-        <w:t>Her katın test penceresi 7 gün × 2 slot — gerçek teslim koşuluyla birebir aynı şekil.</w:t>
+        <w:t>Her katın test penceresi 7 gün × 2 slot = 4.046 satır — gerçek teslim çıktısıyla birebir aynı şekil.</w:t>
       </w:r>
     </w:p>
     <w:p>

</xml_diff>